<commit_message>
added proper user manuals for team members
</commit_message>
<xml_diff>
--- a/SmartStreetlight_User_Manual.docx
+++ b/SmartStreetlight_User_Manual.docx
@@ -10,225 +10,1623 @@
         <w:t>Smart Streetlight Management System - User Manual</w:t>
       </w:r>
     </w:p>
+    <w:p/>
     <w:p>
       <w:pPr>
         <w:pStyle w:val="Heading1"/>
       </w:pPr>
       <w:r>
-        <w:t>1. Introduction</w:t>
+        <w:t>1. Project Overview</w:t>
       </w:r>
     </w:p>
     <w:p>
       <w:r>
-        <w:t>This project is a basic but functional Smart Streetlight Management System designed for a student assignment. The system allows a city maintenance team or administrator to monitor streetlights, identify faults, track energy consumption, and record repair work. It is intentionally simple and easy to understand while still showing good design practice. The application is built using Python and Flask, with MongoDB used for permanent storage and Redis used for fast live data updates. The dashboard shows a summary of the current state of the system and lets users manage lamp records.</w:t>
+        <w:t>This project is a Smart Streetlight Management System created to monitor and manage streetlights in a city or campus environment. The system keeps track of lamp status, brightness, power usage, faults, and maintenance actions. It is designed as a simple student project, but it still includes the major features expected from a basic smart-city application.</w:t>
       </w:r>
     </w:p>
+    <w:p/>
     <w:p>
+      <w:r>
+        <w:t>The project is built using Python, Flask, MongoDB, and Redis. It uses MongoDB for permanent data storage and Redis for quick live updates. The system includes a dashboard that shows the status of all streetlights and a set of API endpoints for adding, updating, deleting, and refreshing lamp records.</w:t>
+      </w:r>
+    </w:p>
+    <w:p/>
+    <w:p>
       <w:pPr>
         <w:pStyle w:val="Heading1"/>
       </w:pPr>
       <w:r>
-        <w:t>2. Purpose of the Project</w:t>
+        <w:t>2. Purpose of the System</w:t>
       </w:r>
     </w:p>
     <w:p>
       <w:r>
-        <w:t>The purpose of the system is to provide a simple tool for monitoring streetlight status, checking which lamps are turned on, dim, or faulty, tracking total energy usage, registering new streetlights, updating existing streetlight details, recording maintenance actions, and responding quickly to lamp faults. This makes the system useful in a real smart-city environment, even though the implementation is intentionally kept simple for academic use.</w:t>
+        <w:t>The main purpose of the system is to help a maintenance team or administrator:</w:t>
       </w:r>
     </w:p>
     <w:p>
       <w:pPr>
+        <w:pStyle w:val="ListBullet"/>
+      </w:pPr>
+      <w:r>
+        <w:t>monitor how many streetlights are active</w:t>
+      </w:r>
+    </w:p>
+    <w:p>
+      <w:pPr>
+        <w:pStyle w:val="ListBullet"/>
+      </w:pPr>
+      <w:r>
+        <w:t>identify which lamps are faulty</w:t>
+      </w:r>
+    </w:p>
+    <w:p>
+      <w:pPr>
+        <w:pStyle w:val="ListBullet"/>
+      </w:pPr>
+      <w:r>
+        <w:t>check brightness and power usage of each lamp</w:t>
+      </w:r>
+    </w:p>
+    <w:p>
+      <w:pPr>
+        <w:pStyle w:val="ListBullet"/>
+      </w:pPr>
+      <w:r>
+        <w:t>keep a record of maintenance performed</w:t>
+      </w:r>
+    </w:p>
+    <w:p>
+      <w:pPr>
+        <w:pStyle w:val="ListBullet"/>
+      </w:pPr>
+      <w:r>
+        <w:t>see total energy usage</w:t>
+      </w:r>
+    </w:p>
+    <w:p>
+      <w:pPr>
+        <w:pStyle w:val="ListBullet"/>
+      </w:pPr>
+      <w:r>
+        <w:t>manage lamp operations through a simple dashboard and API</w:t>
+      </w:r>
+    </w:p>
+    <w:p/>
+    <w:p>
+      <w:pPr>
         <w:pStyle w:val="Heading1"/>
       </w:pPr>
       <w:r>
-        <w:t>3. System Features</w:t>
+        <w:t>3. Why This Project Is Useful</w:t>
       </w:r>
     </w:p>
     <w:p>
       <w:r>
-        <w:t>The system includes a dashboard view, lamp management, maintenance tracking, fault detection, and live refresh. These features allow administrators to add new lamps, update existing entries, delete records, review summary statistics, and observe recent alerts.</w:t>
+        <w:t>Manual streetlight management is slow and unreliable when many lights are spread over a large area. This project makes the process more efficient by centralizing data in one system. It allows maintenance staff to quickly see what needs attention, such as replacing faulty lamps, checking dim lights, or analyzing energy usage trends.</w:t>
       </w:r>
     </w:p>
+    <w:p/>
     <w:p>
       <w:pPr>
         <w:pStyle w:val="Heading1"/>
       </w:pPr>
       <w:r>
-        <w:t>4. Technologies Used</w:t>
+        <w:t>4. Technologies Used and Why They Are Used</w:t>
+      </w:r>
+    </w:p>
+    <w:p/>
+    <w:p>
+      <w:pPr>
+        <w:pStyle w:val="Heading2"/>
+      </w:pPr>
+      <w:r>
+        <w:t>Python</w:t>
       </w:r>
     </w:p>
     <w:p>
       <w:r>
-        <w:t>Python, Flask, MongoDB, Redis, and HTML/CSS are used. Python handles the application logic, Flask serves the routes and APIs, MongoDB stores persistent data, Redis stores live updates and alerts, and HTML/CSS display the dashboard interface.</w:t>
+        <w:t>Python is used because it is easy to read, simple to develop in, and suitable for building backend logic. It is ideal for a student project because it reduces complexity while still being powerful enough to connect with databases and web frameworks.</w:t>
       </w:r>
     </w:p>
+    <w:p/>
     <w:p>
       <w:pPr>
-        <w:pStyle w:val="Heading1"/>
+        <w:pStyle w:val="Heading2"/>
       </w:pPr>
       <w:r>
-        <w:t>5. Software and Environment Requirements</w:t>
+        <w:t>Flask</w:t>
       </w:r>
     </w:p>
     <w:p>
       <w:r>
-        <w:t>To run this project, the machine should have Windows 10 or later, Python 3.12, Flask, MongoDB, Redis, and a browser such as Chrome or Edge.</w:t>
+        <w:t>Flask is used because it is a lightweight web framework. It allows us to create routes, APIs, and dashboard pages without needing a heavy framework. For this project, Flask is the perfect choice because the system is small but still needs many web functions.</w:t>
       </w:r>
     </w:p>
+    <w:p/>
     <w:p>
       <w:pPr>
-        <w:pStyle w:val="Heading1"/>
+        <w:pStyle w:val="Heading2"/>
       </w:pPr>
       <w:r>
-        <w:t>6. Project Structure</w:t>
+        <w:t>MongoDB</w:t>
       </w:r>
     </w:p>
     <w:p>
       <w:r>
-        <w:t>The folder contains app.py, database/mongo_service.py, database/redis_service.py, templates/dashboard.html, static/style.css, README.md, User_Manual.md, Assignment_Report.md, and the exported Word documents.</w:t>
+        <w:t>MongoDB is used for persistent storage. It stores important long-term information such as lamp details, lamp history, power data, fault records, and maintenance history. MongoDB is useful because it handles document-based data easily and works well with Python applications.</w:t>
       </w:r>
     </w:p>
+    <w:p/>
     <w:p>
       <w:pPr>
-        <w:pStyle w:val="Heading1"/>
+        <w:pStyle w:val="Heading2"/>
       </w:pPr>
       <w:r>
-        <w:t>7. System Architecture</w:t>
+        <w:t>Redis</w:t>
       </w:r>
     </w:p>
     <w:p>
       <w:r>
-        <w:t>The project uses a simple architecture with a frontend layer, an application layer, and a data layer. The frontend is the browser dashboard, the application layer is Flask, and the data layer includes MongoDB and Redis.</w:t>
+        <w:t>Redis is used for fast real-time operations. It stores quick state information, alert messages, and live lamp summaries so the dashboard can respond quickly. Redis is especially useful when the system needs live updates with minimal delay.</w:t>
       </w:r>
     </w:p>
+    <w:p/>
     <w:p>
       <w:pPr>
-        <w:pStyle w:val="Heading1"/>
+        <w:pStyle w:val="Heading2"/>
       </w:pPr>
       <w:r>
-        <w:t>8. How the Application Works</w:t>
+        <w:t>HTML and CSS</w:t>
       </w:r>
     </w:p>
     <w:p>
       <w:r>
-        <w:t>When the system starts, Flask starts the web app, MongoDB is checked for stored lamp data, Redis is checked for live state synchronization, the dashboard loads summary data and lamp records, and the user can interact with the API or the dashboard to add, update, delete, or refresh data.</w:t>
+        <w:t>HTML and CSS are used to build the user interface of the dashboard. They give the project a simple web page that displays summary cards, lamp tables, and recent alerts in a readable format.</w:t>
       </w:r>
     </w:p>
+    <w:p/>
     <w:p>
       <w:pPr>
-        <w:pStyle w:val="Heading1"/>
+        <w:pStyle w:val="Heading2"/>
       </w:pPr>
       <w:r>
-        <w:t>9. Installation and Setup</w:t>
+        <w:t>Why these technologies fit the assignment</w:t>
       </w:r>
     </w:p>
     <w:p>
       <w:r>
-        <w:t>Open PowerShell in the project folder, install dependencies using pip install -r requirements.txt, ensure MongoDB and Redis are running locally, then run python app.py or the explicit Python path.</w:t>
+        <w:t>The assignment requires the project to demonstrate the use of a web application with database integration and live data processing. Using Flask + MongoDB + Redis gives a simple but correct structure that matches the requirement and is easy to explain.</w:t>
       </w:r>
     </w:p>
+    <w:p/>
     <w:p>
       <w:pPr>
         <w:pStyle w:val="Heading1"/>
       </w:pPr>
       <w:r>
-        <w:t>10. Running the Project</w:t>
+        <w:t>5. Project Structure</w:t>
       </w:r>
     </w:p>
     <w:p>
       <w:r>
-        <w:t>Once the server starts successfully, open the browser and visit http://127.0.0.1:5000/. The dashboard opens and shows the current lamp summary and data table.</w:t>
+        <w:t>The project is organized as follows:</w:t>
+      </w:r>
+    </w:p>
+    <w:p/>
+    <w:p>
+      <w:pPr>
+        <w:pStyle w:val="ListBullet"/>
+      </w:pPr>
+      <w:r>
+        <w:t>app.py - main Flask application and all route definitions</w:t>
       </w:r>
     </w:p>
     <w:p>
       <w:pPr>
+        <w:pStyle w:val="ListBullet"/>
+      </w:pPr>
+      <w:r>
+        <w:t>database/mongo_service.py - MongoDB logic, lamp data operations, and sample data</w:t>
+      </w:r>
+    </w:p>
+    <w:p>
+      <w:pPr>
+        <w:pStyle w:val="ListBullet"/>
+      </w:pPr>
+      <w:r>
+        <w:t>database/redis_service.py - Redis live data sync, alerts, and summary handling</w:t>
+      </w:r>
+    </w:p>
+    <w:p>
+      <w:pPr>
+        <w:pStyle w:val="ListBullet"/>
+      </w:pPr>
+      <w:r>
+        <w:t>templates/dashboard.html - dashboard page for streetlight information</w:t>
+      </w:r>
+    </w:p>
+    <w:p>
+      <w:pPr>
+        <w:pStyle w:val="ListBullet"/>
+      </w:pPr>
+      <w:r>
+        <w:t>static/style.css - design and page styling</w:t>
+      </w:r>
+    </w:p>
+    <w:p>
+      <w:pPr>
+        <w:pStyle w:val="ListBullet"/>
+      </w:pPr>
+      <w:r>
+        <w:t>README.md - short project overview</w:t>
+      </w:r>
+    </w:p>
+    <w:p>
+      <w:pPr>
+        <w:pStyle w:val="ListBullet"/>
+      </w:pPr>
+      <w:r>
+        <w:t>User_Manual.md - detailed instructions for using and understanding the project</w:t>
+      </w:r>
+    </w:p>
+    <w:p>
+      <w:pPr>
+        <w:pStyle w:val="ListBullet"/>
+      </w:pPr>
+      <w:r>
+        <w:t>Assignment_Report.md - assignment report content</w:t>
+      </w:r>
+    </w:p>
+    <w:p>
+      <w:pPr>
+        <w:pStyle w:val="ListBullet"/>
+      </w:pPr>
+      <w:r>
+        <w:t>SmartStreetlight_Project_Documentation.docx - Word version of the project report</w:t>
+      </w:r>
+    </w:p>
+    <w:p>
+      <w:pPr>
+        <w:pStyle w:val="ListBullet"/>
+      </w:pPr>
+      <w:r>
+        <w:t>SmartStreetlight_User_Manual.docx - Word version of the user manual</w:t>
+      </w:r>
+    </w:p>
+    <w:p/>
+    <w:p>
+      <w:pPr>
         <w:pStyle w:val="Heading1"/>
       </w:pPr>
       <w:r>
-        <w:t>11. Dashboard Guide</w:t>
+        <w:t>6. System Architecture</w:t>
       </w:r>
     </w:p>
     <w:p>
       <w:r>
-        <w:t>The dashboard contains summary cards and a lamp table. These display total lamps, on lamps, dim lamps, faulty lamps, total energy, and recent alerts. The table lists lamp IDs, zones, statuses, brightness, power usage, and update times.</w:t>
+        <w:t>The project follows a simple architecture with three major layers:</w:t>
       </w:r>
     </w:p>
+    <w:p/>
     <w:p>
       <w:pPr>
-        <w:pStyle w:val="Heading1"/>
+        <w:pStyle w:val="Heading2"/>
       </w:pPr>
       <w:r>
-        <w:t>12. API Reference</w:t>
+        <w:t>Frontend Layer</w:t>
       </w:r>
     </w:p>
     <w:p>
       <w:r>
-        <w:t>The application provides endpoints for the dashboard summary, lamp listing, lamp creation, lamp updates, lamp deletion, maintenance records, and refresh actions. Each endpoint returns JSON responses suitable for testing or UI integration.</w:t>
+        <w:t>This is the dashboard shown in the browser. It displays lamp data, summary cards, and alerts.</w:t>
       </w:r>
     </w:p>
+    <w:p/>
     <w:p>
       <w:pPr>
-        <w:pStyle w:val="Heading1"/>
+        <w:pStyle w:val="Heading2"/>
       </w:pPr>
       <w:r>
-        <w:t>13. Example API Calls</w:t>
+        <w:t>Application Layer</w:t>
       </w:r>
     </w:p>
     <w:p>
       <w:r>
-        <w:t>Examples include viewing all lights, adding a lamp, updating a lamp, deleting a lamp, recording maintenance, and refreshing lamp data. These calls can be run from PowerShell or any HTTP client.</w:t>
+        <w:t>Flask acts as the application layer. It handles requests from the browser, runs the business logic, and returns either a web page or JSON data.</w:t>
+      </w:r>
+    </w:p>
+    <w:p/>
+    <w:p>
+      <w:pPr>
+        <w:pStyle w:val="Heading2"/>
+      </w:pPr>
+      <w:r>
+        <w:t>Data Layer</w:t>
       </w:r>
     </w:p>
     <w:p>
       <w:pPr>
+        <w:pStyle w:val="ListBullet"/>
+      </w:pPr>
+      <w:r>
+        <w:t>MongoDB stores long-term lamp records and maintenance data.</w:t>
+      </w:r>
+    </w:p>
+    <w:p>
+      <w:pPr>
+        <w:pStyle w:val="ListBullet"/>
+      </w:pPr>
+      <w:r>
+        <w:t>Redis stores live lamp state and recent alerts for fast access.</w:t>
+      </w:r>
+    </w:p>
+    <w:p/>
+    <w:p>
+      <w:r>
+        <w:t>This division is important because MongoDB is better for permanent storage while Redis is better for fast current data access.</w:t>
+      </w:r>
+    </w:p>
+    <w:p/>
+    <w:p>
+      <w:pPr>
         <w:pStyle w:val="Heading1"/>
       </w:pPr>
       <w:r>
-        <w:t>14. MongoDB and Redis Roles</w:t>
+        <w:t>7. How the Application Works</w:t>
       </w:r>
     </w:p>
     <w:p>
       <w:r>
-        <w:t>MongoDB is used for persistent storage such as lamp records and maintenance history, while Redis stores live state and recent alerts. This separation is important for system design.</w:t>
-      </w:r>
-    </w:p>
-    <w:p>
-      <w:pPr>
-        <w:pStyle w:val="Heading1"/>
-      </w:pPr>
-      <w:r>
-        <w:t>15. Troubleshooting</w:t>
+        <w:t>When the program starts:</w:t>
       </w:r>
     </w:p>
     <w:p>
       <w:r>
-        <w:t>Common issues include app startup problems, missing dependencies, database not running, or missing live updates. The solution normally involves checking the Python interpreter, installing requirements, and ensuring MongoDB and Redis are active.</w:t>
-      </w:r>
-    </w:p>
-    <w:p>
-      <w:pPr>
-        <w:pStyle w:val="Heading1"/>
-      </w:pPr>
-      <w:r>
-        <w:t>16. Notes for Student Submission</w:t>
+        <w:t>1. The Flask app starts running.</w:t>
       </w:r>
     </w:p>
     <w:p>
       <w:r>
-        <w:t>This project is intentionally kept simple and readable so it remains suitable for a student assignment. It demonstrates a practical smart-city solution without overcomplicating the system.</w:t>
-      </w:r>
-    </w:p>
-    <w:p>
-      <w:pPr>
-        <w:pStyle w:val="Heading1"/>
-      </w:pPr>
-      <w:r>
-        <w:t>17. Final Summary</w:t>
+        <w:t>2. MongoDB is checked for stored lamp data.</w:t>
       </w:r>
     </w:p>
     <w:p>
       <w:r>
-        <w:t>The Smart Streetlight Management System gives a clear demonstration of how basic city infrastructure can be monitored digitally. It helps maintenance teams keep track of lamp health, identify faults quickly, store historical records, and act on live data.</w:t>
+        <w:t>3. Redis is checked for current live data and alerts.</w:t>
+      </w:r>
+    </w:p>
+    <w:p>
+      <w:r>
+        <w:t>4. The dashboard loads summary values and lamp records.</w:t>
+      </w:r>
+    </w:p>
+    <w:p>
+      <w:r>
+        <w:t>5. Users can add, update, delete, or refresh data by interacting with the dashboard or API.</w:t>
+      </w:r>
+    </w:p>
+    <w:p/>
+    <w:p>
+      <w:r>
+        <w:t>The system can also work with sample fallback data in case MongoDB or Redis is not active.</w:t>
+      </w:r>
+    </w:p>
+    <w:p/>
+    <w:p>
+      <w:pPr>
+        <w:pStyle w:val="Heading1"/>
+      </w:pPr>
+      <w:r>
+        <w:t>8. What the Main Project Files Do</w:t>
+      </w:r>
+    </w:p>
+    <w:p/>
+    <w:p>
+      <w:pPr>
+        <w:pStyle w:val="Heading2"/>
+      </w:pPr>
+      <w:r>
+        <w:t>app.py</w:t>
+      </w:r>
+    </w:p>
+    <w:p>
+      <w:r>
+        <w:t>This is the main file of the project. It contains all the routes for the home page, dashboard, summary API, lamp CRUD operations, maintenance tracking, and refresh actions. This file ties the entire application together.</w:t>
+      </w:r>
+    </w:p>
+    <w:p/>
+    <w:p>
+      <w:pPr>
+        <w:pStyle w:val="Heading2"/>
+      </w:pPr>
+      <w:r>
+        <w:t>database/mongo_service.py</w:t>
+      </w:r>
+    </w:p>
+    <w:p>
+      <w:r>
+        <w:t>This file handles all MongoDB operations. It is responsible for:</w:t>
+      </w:r>
+    </w:p>
+    <w:p>
+      <w:pPr>
+        <w:pStyle w:val="ListBullet"/>
+      </w:pPr>
+      <w:r>
+        <w:t>connecting to the database</w:t>
+      </w:r>
+    </w:p>
+    <w:p>
+      <w:pPr>
+        <w:pStyle w:val="ListBullet"/>
+      </w:pPr>
+      <w:r>
+        <w:t>inserting and updating records</w:t>
+      </w:r>
+    </w:p>
+    <w:p>
+      <w:pPr>
+        <w:pStyle w:val="ListBullet"/>
+      </w:pPr>
+      <w:r>
+        <w:t>reading lamp information</w:t>
+      </w:r>
+    </w:p>
+    <w:p>
+      <w:pPr>
+        <w:pStyle w:val="ListBullet"/>
+      </w:pPr>
+      <w:r>
+        <w:t>counting total lamps and statuses</w:t>
+      </w:r>
+    </w:p>
+    <w:p>
+      <w:pPr>
+        <w:pStyle w:val="ListBullet"/>
+      </w:pPr>
+      <w:r>
+        <w:t>calculating total energy usage</w:t>
+      </w:r>
+    </w:p>
+    <w:p>
+      <w:pPr>
+        <w:pStyle w:val="ListBullet"/>
+      </w:pPr>
+      <w:r>
+        <w:t>storing maintenance history</w:t>
+      </w:r>
+    </w:p>
+    <w:p>
+      <w:pPr>
+        <w:pStyle w:val="ListBullet"/>
+      </w:pPr>
+      <w:r>
+        <w:t>returning fault data</w:t>
+      </w:r>
+    </w:p>
+    <w:p/>
+    <w:p>
+      <w:pPr>
+        <w:pStyle w:val="Heading2"/>
+      </w:pPr>
+      <w:r>
+        <w:t>database/redis_service.py</w:t>
+      </w:r>
+    </w:p>
+    <w:p>
+      <w:r>
+        <w:t>This file handles Redis operations. It is responsible for:</w:t>
+      </w:r>
+    </w:p>
+    <w:p>
+      <w:pPr>
+        <w:pStyle w:val="ListBullet"/>
+      </w:pPr>
+      <w:r>
+        <w:t>syncing lamp data from MongoDB to Redis</w:t>
+      </w:r>
+    </w:p>
+    <w:p>
+      <w:pPr>
+        <w:pStyle w:val="ListBullet"/>
+      </w:pPr>
+      <w:r>
+        <w:t>saving summary values</w:t>
+      </w:r>
+    </w:p>
+    <w:p>
+      <w:pPr>
+        <w:pStyle w:val="ListBullet"/>
+      </w:pPr>
+      <w:r>
+        <w:t>storing live states for each lamp</w:t>
+      </w:r>
+    </w:p>
+    <w:p>
+      <w:pPr>
+        <w:pStyle w:val="ListBullet"/>
+      </w:pPr>
+      <w:r>
+        <w:t>tracking recent alerts</w:t>
+      </w:r>
+    </w:p>
+    <w:p>
+      <w:pPr>
+        <w:pStyle w:val="ListBullet"/>
+      </w:pPr>
+      <w:r>
+        <w:t>keeping the dashboard response quick and efficient</w:t>
+      </w:r>
+    </w:p>
+    <w:p/>
+    <w:p>
+      <w:pPr>
+        <w:pStyle w:val="Heading2"/>
+      </w:pPr>
+      <w:r>
+        <w:t>templates/dashboard.html</w:t>
+      </w:r>
+    </w:p>
+    <w:p>
+      <w:r>
+        <w:t>This file contains the dashboard page structure. It displays the summary cards and the table of streetlights.</w:t>
+      </w:r>
+    </w:p>
+    <w:p/>
+    <w:p>
+      <w:pPr>
+        <w:pStyle w:val="Heading2"/>
+      </w:pPr>
+      <w:r>
+        <w:t>static/style.css</w:t>
+      </w:r>
+    </w:p>
+    <w:p>
+      <w:r>
+        <w:t>This file gives the dashboard a clean student-friendly visual design.</w:t>
+      </w:r>
+    </w:p>
+    <w:p/>
+    <w:p>
+      <w:pPr>
+        <w:pStyle w:val="Heading1"/>
+      </w:pPr>
+      <w:r>
+        <w:t>9. Available Endpoints and Their Functions</w:t>
+      </w:r>
+    </w:p>
+    <w:p/>
+    <w:p>
+      <w:pPr>
+        <w:pStyle w:val="Heading2"/>
+      </w:pPr>
+      <w:r>
+        <w:t>GET /</w:t>
+      </w:r>
+    </w:p>
+    <w:p>
+      <w:r>
+        <w:t>This route opens the home page of the application and loads the dashboard.</w:t>
+      </w:r>
+    </w:p>
+    <w:p/>
+    <w:p>
+      <w:pPr>
+        <w:pStyle w:val="Heading2"/>
+      </w:pPr>
+      <w:r>
+        <w:t>GET /dashboard</w:t>
+      </w:r>
+    </w:p>
+    <w:p>
+      <w:r>
+        <w:t>This route also opens the dashboard page. It shows the same interface as the home page.</w:t>
+      </w:r>
+    </w:p>
+    <w:p/>
+    <w:p>
+      <w:pPr>
+        <w:pStyle w:val="Heading2"/>
+      </w:pPr>
+      <w:r>
+        <w:t>GET /api/summary</w:t>
+      </w:r>
+    </w:p>
+    <w:p>
+      <w:r>
+        <w:t>This endpoint returns overall summary information for the system. It includes:</w:t>
+      </w:r>
+    </w:p>
+    <w:p>
+      <w:pPr>
+        <w:pStyle w:val="ListBullet"/>
+      </w:pPr>
+      <w:r>
+        <w:t>total number of lamps</w:t>
+      </w:r>
+    </w:p>
+    <w:p>
+      <w:pPr>
+        <w:pStyle w:val="ListBullet"/>
+      </w:pPr>
+      <w:r>
+        <w:t>number of lamps currently on</w:t>
+      </w:r>
+    </w:p>
+    <w:p>
+      <w:pPr>
+        <w:pStyle w:val="ListBullet"/>
+      </w:pPr>
+      <w:r>
+        <w:t>number of dim lamps</w:t>
+      </w:r>
+    </w:p>
+    <w:p>
+      <w:pPr>
+        <w:pStyle w:val="ListBullet"/>
+      </w:pPr>
+      <w:r>
+        <w:t>number of faulty lamps</w:t>
+      </w:r>
+    </w:p>
+    <w:p>
+      <w:pPr>
+        <w:pStyle w:val="ListBullet"/>
+      </w:pPr>
+      <w:r>
+        <w:t>total energy</w:t>
+      </w:r>
+    </w:p>
+    <w:p>
+      <w:pPr>
+        <w:pStyle w:val="ListBullet"/>
+      </w:pPr>
+      <w:r>
+        <w:t>MongoDB connection status</w:t>
+      </w:r>
+    </w:p>
+    <w:p>
+      <w:pPr>
+        <w:pStyle w:val="ListBullet"/>
+      </w:pPr>
+      <w:r>
+        <w:t>Redis connection status</w:t>
+      </w:r>
+    </w:p>
+    <w:p/>
+    <w:p>
+      <w:pPr>
+        <w:pStyle w:val="Heading2"/>
+      </w:pPr>
+      <w:r>
+        <w:t>GET /api/lights</w:t>
+      </w:r>
+    </w:p>
+    <w:p>
+      <w:r>
+        <w:t>This endpoint returns all lamp records in JSON format. It is also used to list the current lights in the dashboard.</w:t>
+      </w:r>
+    </w:p>
+    <w:p/>
+    <w:p>
+      <w:pPr>
+        <w:pStyle w:val="Heading2"/>
+      </w:pPr>
+      <w:r>
+        <w:t>POST /api/lights</w:t>
+      </w:r>
+    </w:p>
+    <w:p>
+      <w:r>
+        <w:t>This route adds a new streetlight. It accepts JSON input and creates a new lamp record.</w:t>
+      </w:r>
+    </w:p>
+    <w:p/>
+    <w:p>
+      <w:r>
+        <w:t>Example body:</w:t>
+      </w:r>
+    </w:p>
+    <w:p>
+      <w:r>
+        <w:t>{</w:t>
+      </w:r>
+    </w:p>
+    <w:p>
+      <w:r>
+        <w:t xml:space="preserve">  "lamp_id": "SL-900",</w:t>
+      </w:r>
+    </w:p>
+    <w:p>
+      <w:r>
+        <w:t xml:space="preserve">  "zone": "Main Road",</w:t>
+      </w:r>
+    </w:p>
+    <w:p>
+      <w:r>
+        <w:t xml:space="preserve">  "location": "Near Park",</w:t>
+      </w:r>
+    </w:p>
+    <w:p>
+      <w:r>
+        <w:t xml:space="preserve">  "power_rating": 90,</w:t>
+      </w:r>
+    </w:p>
+    <w:p>
+      <w:r>
+        <w:t xml:space="preserve">  "brightness": 100,</w:t>
+      </w:r>
+    </w:p>
+    <w:p>
+      <w:r>
+        <w:t xml:space="preserve">  "status": "on",</w:t>
+      </w:r>
+    </w:p>
+    <w:p>
+      <w:r>
+        <w:t xml:space="preserve">  "fault": false,</w:t>
+      </w:r>
+    </w:p>
+    <w:p>
+      <w:r>
+        <w:t xml:space="preserve">  "lamp_type": "LED"</w:t>
+      </w:r>
+    </w:p>
+    <w:p>
+      <w:r>
+        <w:t>}</w:t>
+      </w:r>
+    </w:p>
+    <w:p/>
+    <w:p>
+      <w:pPr>
+        <w:pStyle w:val="Heading2"/>
+      </w:pPr>
+      <w:r>
+        <w:t>PUT /api/lights/&lt;lamp_id&gt;</w:t>
+      </w:r>
+    </w:p>
+    <w:p>
+      <w:r>
+        <w:t>This route updates a specific streetlight by lamp ID. It can update values such as brightness, status, zone, and fault state.</w:t>
+      </w:r>
+    </w:p>
+    <w:p/>
+    <w:p>
+      <w:pPr>
+        <w:pStyle w:val="Heading2"/>
+      </w:pPr>
+      <w:r>
+        <w:t>DELETE /api/lights/&lt;lamp_id&gt;</w:t>
+      </w:r>
+    </w:p>
+    <w:p>
+      <w:r>
+        <w:t>This route deletes one streetlight from the system using its lamp ID.</w:t>
+      </w:r>
+    </w:p>
+    <w:p/>
+    <w:p>
+      <w:pPr>
+        <w:pStyle w:val="Heading2"/>
+      </w:pPr>
+      <w:r>
+        <w:t>POST /api/maintenance</w:t>
+      </w:r>
+    </w:p>
+    <w:p>
+      <w:r>
+        <w:t>This route records maintenance activity for a lamp. It stores details such as:</w:t>
+      </w:r>
+    </w:p>
+    <w:p>
+      <w:pPr>
+        <w:pStyle w:val="ListBullet"/>
+      </w:pPr>
+      <w:r>
+        <w:t>lamp ID</w:t>
+      </w:r>
+    </w:p>
+    <w:p>
+      <w:pPr>
+        <w:pStyle w:val="ListBullet"/>
+      </w:pPr>
+      <w:r>
+        <w:t>action taken</w:t>
+      </w:r>
+    </w:p>
+    <w:p>
+      <w:pPr>
+        <w:pStyle w:val="ListBullet"/>
+      </w:pPr>
+      <w:r>
+        <w:t>description</w:t>
+      </w:r>
+    </w:p>
+    <w:p>
+      <w:pPr>
+        <w:pStyle w:val="ListBullet"/>
+      </w:pPr>
+      <w:r>
+        <w:t>technician name</w:t>
+      </w:r>
+    </w:p>
+    <w:p>
+      <w:pPr>
+        <w:pStyle w:val="ListBullet"/>
+      </w:pPr>
+      <w:r>
+        <w:t>date/time</w:t>
+      </w:r>
+    </w:p>
+    <w:p/>
+    <w:p>
+      <w:r>
+        <w:t>Example body:</w:t>
+      </w:r>
+    </w:p>
+    <w:p>
+      <w:r>
+        <w:t>{</w:t>
+      </w:r>
+    </w:p>
+    <w:p>
+      <w:r>
+        <w:t xml:space="preserve">  "lamp_id": "SL-101",</w:t>
+      </w:r>
+    </w:p>
+    <w:p>
+      <w:r>
+        <w:t xml:space="preserve">  "action": "repair",</w:t>
+      </w:r>
+    </w:p>
+    <w:p>
+      <w:r>
+        <w:t xml:space="preserve">  "description": "Replaced damaged bulb and checked wiring.",</w:t>
+      </w:r>
+    </w:p>
+    <w:p>
+      <w:r>
+        <w:t xml:space="preserve">  "technician": "Tech 1"</w:t>
+      </w:r>
+    </w:p>
+    <w:p>
+      <w:r>
+        <w:t>}</w:t>
+      </w:r>
+    </w:p>
+    <w:p/>
+    <w:p>
+      <w:pPr>
+        <w:pStyle w:val="Heading2"/>
+      </w:pPr>
+      <w:r>
+        <w:t>GET /api/refresh</w:t>
+      </w:r>
+    </w:p>
+    <w:p>
+      <w:r>
+        <w:t>This endpoint simulates a live refresh of lamp data. It updates lamp states and recalculates the summary and alert list.</w:t>
+      </w:r>
+    </w:p>
+    <w:p/>
+    <w:p>
+      <w:pPr>
+        <w:pStyle w:val="Heading1"/>
+      </w:pPr>
+      <w:r>
+        <w:t>10. What Important Python Keywords Do in This Project</w:t>
+      </w:r>
+    </w:p>
+    <w:p>
+      <w:r>
+        <w:t>This section explains the most important code ideas used in the project so that group members can understand the logic.</w:t>
+      </w:r>
+    </w:p>
+    <w:p/>
+    <w:p>
+      <w:pPr>
+        <w:pStyle w:val="Heading2"/>
+      </w:pPr>
+      <w:r>
+        <w:t>Flask keywords</w:t>
+      </w:r>
+    </w:p>
+    <w:p/>
+    <w:p>
+      <w:r>
+        <w:t>#### app = Flask(__name__)</w:t>
+      </w:r>
+    </w:p>
+    <w:p>
+      <w:r>
+        <w:t>This creates the Flask web application object. It is the main application instance that receives requests and routes them.</w:t>
+      </w:r>
+    </w:p>
+    <w:p/>
+    <w:p>
+      <w:r>
+        <w:t>#### @app.route('/')</w:t>
+      </w:r>
+    </w:p>
+    <w:p>
+      <w:r>
+        <w:t>This is a decorator that tells Flask which function should run when a user visits a particular URL. It links URLs to Python functions.</w:t>
+      </w:r>
+    </w:p>
+    <w:p/>
+    <w:p>
+      <w:r>
+        <w:t>#### render_template(...)</w:t>
+      </w:r>
+    </w:p>
+    <w:p>
+      <w:r>
+        <w:t>This function loads an HTML page from the templates folder and sends the required data to that page. It is used to render the dashboard.</w:t>
+      </w:r>
+    </w:p>
+    <w:p/>
+    <w:p>
+      <w:r>
+        <w:t>#### jsonify(...)</w:t>
+      </w:r>
+    </w:p>
+    <w:p>
+      <w:r>
+        <w:t>This converts Python data structures into JSON output. This is used for API responses so the browser or client can read them easily.</w:t>
+      </w:r>
+    </w:p>
+    <w:p/>
+    <w:p>
+      <w:r>
+        <w:t>#### request</w:t>
+      </w:r>
+    </w:p>
+    <w:p>
+      <w:r>
+        <w:t>This object contains information from incoming requests, including JSON bodies sent by the client.</w:t>
+      </w:r>
+    </w:p>
+    <w:p/>
+    <w:p>
+      <w:pPr>
+        <w:pStyle w:val="Heading2"/>
+      </w:pPr>
+      <w:r>
+        <w:t>MongoDB keywords</w:t>
+      </w:r>
+    </w:p>
+    <w:p/>
+    <w:p>
+      <w:r>
+        <w:t>#### MongoClient(...)</w:t>
+      </w:r>
+    </w:p>
+    <w:p>
+      <w:r>
+        <w:t>This creates a connection to MongoDB. It allows the app to communicate with the local MongoDB server.</w:t>
+      </w:r>
+    </w:p>
+    <w:p/>
+    <w:p>
+      <w:r>
+        <w:t>#### self.collection.find()</w:t>
+      </w:r>
+    </w:p>
+    <w:p>
+      <w:r>
+        <w:t>This reads all records from the collection. It is used to list all lamps.</w:t>
+      </w:r>
+    </w:p>
+    <w:p/>
+    <w:p>
+      <w:r>
+        <w:t>#### self.collection.insert_many(...)</w:t>
+      </w:r>
+    </w:p>
+    <w:p>
+      <w:r>
+        <w:t>This inserts multiple documents into the database in one operation.</w:t>
+      </w:r>
+    </w:p>
+    <w:p/>
+    <w:p>
+      <w:r>
+        <w:t>#### self.collection.update_one(...)</w:t>
+      </w:r>
+    </w:p>
+    <w:p>
+      <w:r>
+        <w:t>This updates one matching document. It is used to change lamp status, fault conditions, or maintenance details.</w:t>
+      </w:r>
+    </w:p>
+    <w:p/>
+    <w:p>
+      <w:r>
+        <w:t>#### self.collection.delete_one(...)</w:t>
+      </w:r>
+    </w:p>
+    <w:p>
+      <w:r>
+        <w:t>This deletes a single matching lamp record.</w:t>
+      </w:r>
+    </w:p>
+    <w:p/>
+    <w:p>
+      <w:r>
+        <w:t>#### self.collection.count_documents(...)</w:t>
+      </w:r>
+    </w:p>
+    <w:p>
+      <w:r>
+        <w:t>This counts records in the collection. It is used to calculate totals like the number of on lamps or faulty lamps.</w:t>
+      </w:r>
+    </w:p>
+    <w:p/>
+    <w:p>
+      <w:pPr>
+        <w:pStyle w:val="Heading2"/>
+      </w:pPr>
+      <w:r>
+        <w:t>Redis keywords</w:t>
+      </w:r>
+    </w:p>
+    <w:p/>
+    <w:p>
+      <w:r>
+        <w:t>#### redis.Redis(...)</w:t>
+      </w:r>
+    </w:p>
+    <w:p>
+      <w:r>
+        <w:t>This creates a Redis client connection. It lets the application talk to the Redis server.</w:t>
+      </w:r>
+    </w:p>
+    <w:p/>
+    <w:p>
+      <w:r>
+        <w:t>#### hset(...)</w:t>
+      </w:r>
+    </w:p>
+    <w:p>
+      <w:r>
+        <w:t>This stores field-value pairs in a Redis hash. It is used to save lamp status and summary values.</w:t>
+      </w:r>
+    </w:p>
+    <w:p/>
+    <w:p>
+      <w:r>
+        <w:t>#### sadd(...)</w:t>
+      </w:r>
+    </w:p>
+    <w:p>
+      <w:r>
+        <w:t>This adds elements to a Redis set. It is used to hold all lamp IDs and faulty lamp IDs.</w:t>
+      </w:r>
+    </w:p>
+    <w:p/>
+    <w:p>
+      <w:r>
+        <w:t>#### lpush(...)</w:t>
+      </w:r>
+    </w:p>
+    <w:p>
+      <w:r>
+        <w:t>This inserts a new value at the front of a Redis list. It is used to store recent alerts.</w:t>
+      </w:r>
+    </w:p>
+    <w:p/>
+    <w:p>
+      <w:r>
+        <w:t>#### lrange(...)</w:t>
+      </w:r>
+    </w:p>
+    <w:p>
+      <w:r>
+        <w:t>This reads a range of alert items from a list. It is used to show recent alerts on the dashboard.</w:t>
+      </w:r>
+    </w:p>
+    <w:p/>
+    <w:p>
+      <w:pPr>
+        <w:pStyle w:val="Heading1"/>
+      </w:pPr>
+      <w:r>
+        <w:t>11. Installation and Setup</w:t>
+      </w:r>
+    </w:p>
+    <w:p>
+      <w:r>
+        <w:t>Follow these steps carefully.</w:t>
+      </w:r>
+    </w:p>
+    <w:p/>
+    <w:p>
+      <w:pPr>
+        <w:pStyle w:val="Heading2"/>
+      </w:pPr>
+      <w:r>
+        <w:t>Step 1: Open a terminal</w:t>
+      </w:r>
+    </w:p>
+    <w:p>
+      <w:r>
+        <w:t>Open PowerShell or the terminal in the project folder.</w:t>
+      </w:r>
+    </w:p>
+    <w:p/>
+    <w:p>
+      <w:pPr>
+        <w:pStyle w:val="Heading2"/>
+      </w:pPr>
+      <w:r>
+        <w:t>Step 2: Install dependencies</w:t>
+      </w:r>
+    </w:p>
+    <w:p>
+      <w:r>
+        <w:t>Run:</w:t>
+      </w:r>
+    </w:p>
+    <w:p>
+      <w:r>
+        <w:t>pip install -r requirements.txt</w:t>
+      </w:r>
+    </w:p>
+    <w:p/>
+    <w:p>
+      <w:r>
+        <w:t>This installs:</w:t>
+      </w:r>
+    </w:p>
+    <w:p>
+      <w:pPr>
+        <w:pStyle w:val="ListBullet"/>
+      </w:pPr>
+      <w:r>
+        <w:t>Flask</w:t>
+      </w:r>
+    </w:p>
+    <w:p>
+      <w:pPr>
+        <w:pStyle w:val="ListBullet"/>
+      </w:pPr>
+      <w:r>
+        <w:t>pymongo</w:t>
+      </w:r>
+    </w:p>
+    <w:p>
+      <w:pPr>
+        <w:pStyle w:val="ListBullet"/>
+      </w:pPr>
+      <w:r>
+        <w:t>redis</w:t>
+      </w:r>
+    </w:p>
+    <w:p/>
+    <w:p>
+      <w:pPr>
+        <w:pStyle w:val="Heading2"/>
+      </w:pPr>
+      <w:r>
+        <w:t>Step 3: Start MongoDB</w:t>
+      </w:r>
+    </w:p>
+    <w:p>
+      <w:r>
+        <w:t>Make sure MongoDB is installed and running locally. The default local connection is:</w:t>
+      </w:r>
+    </w:p>
+    <w:p>
+      <w:r>
+        <w:t>mongodb://localhost:27017/</w:t>
+      </w:r>
+    </w:p>
+    <w:p/>
+    <w:p>
+      <w:pPr>
+        <w:pStyle w:val="Heading2"/>
+      </w:pPr>
+      <w:r>
+        <w:t>Step 4: Start Redis</w:t>
+      </w:r>
+    </w:p>
+    <w:p>
+      <w:r>
+        <w:t>Make sure Redis is running locally on:</w:t>
+      </w:r>
+    </w:p>
+    <w:p>
+      <w:r>
+        <w:t>localhost:6379</w:t>
+      </w:r>
+    </w:p>
+    <w:p/>
+    <w:p>
+      <w:pPr>
+        <w:pStyle w:val="Heading2"/>
+      </w:pPr>
+      <w:r>
+        <w:t>Step 5: Run the project</w:t>
+      </w:r>
+    </w:p>
+    <w:p>
+      <w:r>
+        <w:t>Run:</w:t>
+      </w:r>
+    </w:p>
+    <w:p>
+      <w:r>
+        <w:t>python app.py</w:t>
+      </w:r>
+    </w:p>
+    <w:p/>
+    <w:p>
+      <w:r>
+        <w:t>If Windows does not use the default Python command, use the local executable directly:</w:t>
+      </w:r>
+    </w:p>
+    <w:p>
+      <w:r>
+        <w:t>&amp; 'C:\Users\Pradeep\AppData\Local\Programs\Python\Python312\python.exe' app.py</w:t>
+      </w:r>
+    </w:p>
+    <w:p/>
+    <w:p>
+      <w:pPr>
+        <w:pStyle w:val="Heading1"/>
+      </w:pPr>
+      <w:r>
+        <w:t>12. How to Use the Dashboard</w:t>
+      </w:r>
+    </w:p>
+    <w:p>
+      <w:r>
+        <w:t>After starting the app, open this address in the browser:</w:t>
+      </w:r>
+    </w:p>
+    <w:p>
+      <w:r>
+        <w:t>http://127.0.0.1:5000/</w:t>
+      </w:r>
+    </w:p>
+    <w:p/>
+    <w:p>
+      <w:r>
+        <w:t>The dashboard displays:</w:t>
+      </w:r>
+    </w:p>
+    <w:p>
+      <w:pPr>
+        <w:pStyle w:val="ListBullet"/>
+      </w:pPr>
+      <w:r>
+        <w:t>summary cards</w:t>
+      </w:r>
+    </w:p>
+    <w:p>
+      <w:pPr>
+        <w:pStyle w:val="ListBullet"/>
+      </w:pPr>
+      <w:r>
+        <w:t>total number of lamps</w:t>
+      </w:r>
+    </w:p>
+    <w:p>
+      <w:pPr>
+        <w:pStyle w:val="ListBullet"/>
+      </w:pPr>
+      <w:r>
+        <w:t>lamp status categories</w:t>
+      </w:r>
+    </w:p>
+    <w:p>
+      <w:pPr>
+        <w:pStyle w:val="ListBullet"/>
+      </w:pPr>
+      <w:r>
+        <w:t>list of all lamps</w:t>
+      </w:r>
+    </w:p>
+    <w:p>
+      <w:pPr>
+        <w:pStyle w:val="ListBullet"/>
+      </w:pPr>
+      <w:r>
+        <w:t>fault alerts</w:t>
+      </w:r>
+    </w:p>
+    <w:p/>
+    <w:p>
+      <w:r>
+        <w:t>You can observe the current state of each lamp and refresh the view when needed.</w:t>
+      </w:r>
+    </w:p>
+    <w:p/>
+    <w:p>
+      <w:pPr>
+        <w:pStyle w:val="Heading1"/>
+      </w:pPr>
+      <w:r>
+        <w:t>13. Testing the Project Using API Calls</w:t>
+      </w:r>
+    </w:p>
+    <w:p>
+      <w:r>
+        <w:t>The project can be tested through the browser or using command-line tools such as curl.</w:t>
+      </w:r>
+    </w:p>
+    <w:p/>
+    <w:p>
+      <w:pPr>
+        <w:pStyle w:val="Heading2"/>
+      </w:pPr>
+      <w:r>
+        <w:t>Example: View all lamps</w:t>
+      </w:r>
+    </w:p>
+    <w:p>
+      <w:r>
+        <w:t>curl http://127.0.0.1:5000/api/lights</w:t>
+      </w:r>
+    </w:p>
+    <w:p/>
+    <w:p>
+      <w:pPr>
+        <w:pStyle w:val="Heading2"/>
+      </w:pPr>
+      <w:r>
+        <w:t>Example: Add a lamp</w:t>
+      </w:r>
+    </w:p>
+    <w:p>
+      <w:r>
+        <w:t>curl -X POST http://127.0.0.1:5000/api/lights -H "Content-Type: application/json" -d "{\"lamp_id\":\"SL-900\",\"zone\":\"Main Road\",\"location\":\"Near Park\",\"power_rating\":90,\"brightness\":100,\"status\":\"on\",\"fault\":false}"</w:t>
+      </w:r>
+    </w:p>
+    <w:p/>
+    <w:p>
+      <w:pPr>
+        <w:pStyle w:val="Heading2"/>
+      </w:pPr>
+      <w:r>
+        <w:t>Example: Update a lamp</w:t>
+      </w:r>
+    </w:p>
+    <w:p>
+      <w:r>
+        <w:t>curl -X PUT http://127.0.0.1:5000/api/lights/SL-900 -H "Content-Type: application/json" -d "{\"status\":\"dim\",\"brightness\":50}"</w:t>
+      </w:r>
+    </w:p>
+    <w:p/>
+    <w:p>
+      <w:pPr>
+        <w:pStyle w:val="Heading2"/>
+      </w:pPr>
+      <w:r>
+        <w:t>Example: Delete a lamp</w:t>
+      </w:r>
+    </w:p>
+    <w:p>
+      <w:r>
+        <w:t>curl -X DELETE http://127.0.0.1:5000/api/lights/SL-900</w:t>
+      </w:r>
+    </w:p>
+    <w:p/>
+    <w:p>
+      <w:pPr>
+        <w:pStyle w:val="Heading2"/>
+      </w:pPr>
+      <w:r>
+        <w:t>Example: Add maintenance record</w:t>
+      </w:r>
+    </w:p>
+    <w:p>
+      <w:r>
+        <w:t>curl -X POST http://127.0.0.1:5000/api/maintenance -H "Content-Type: application/json" -d "{\"lamp_id\":\"SL-101\",\"action\":\"repair\",\"description\":\"Replaced bulb\",\"technician\":\"Tech 1\"}"</w:t>
+      </w:r>
+    </w:p>
+    <w:p/>
+    <w:p>
+      <w:pPr>
+        <w:pStyle w:val="Heading2"/>
+      </w:pPr>
+      <w:r>
+        <w:t>Example: Refresh live data</w:t>
+      </w:r>
+    </w:p>
+    <w:p>
+      <w:r>
+        <w:t>curl http://127.0.0.1:5000/api/refresh</w:t>
+      </w:r>
+    </w:p>
+    <w:p/>
+    <w:p>
+      <w:pPr>
+        <w:pStyle w:val="Heading1"/>
+      </w:pPr>
+      <w:r>
+        <w:t>14. Troubleshooting</w:t>
+      </w:r>
+    </w:p>
+    <w:p/>
+    <w:p>
+      <w:pPr>
+        <w:pStyle w:val="Heading2"/>
+      </w:pPr>
+      <w:r>
+        <w:t>The app does not run</w:t>
+      </w:r>
+    </w:p>
+    <w:p>
+      <w:r>
+        <w:t>Check whether the dependencies have been installed correctly.</w:t>
+      </w:r>
+    </w:p>
+    <w:p>
+      <w:r>
+        <w:t>pip install -r requirements.txt</w:t>
+      </w:r>
+    </w:p>
+    <w:p/>
+    <w:p>
+      <w:pPr>
+        <w:pStyle w:val="Heading2"/>
+      </w:pPr>
+      <w:r>
+        <w:t>The browser shows no dashboard</w:t>
+      </w:r>
+    </w:p>
+    <w:p>
+      <w:r>
+        <w:t>Check whether Flask is running. If the local Python command does not work, use the exact Python path.</w:t>
+      </w:r>
+    </w:p>
+    <w:p/>
+    <w:p>
+      <w:pPr>
+        <w:pStyle w:val="Heading2"/>
+      </w:pPr>
+      <w:r>
+        <w:t>MongoDB is not connected</w:t>
+      </w:r>
+    </w:p>
+    <w:p>
+      <w:r>
+        <w:t>Make sure MongoDB is installed and running. Otherwise, the app may use sample fallback data.</w:t>
+      </w:r>
+    </w:p>
+    <w:p/>
+    <w:p>
+      <w:pPr>
+        <w:pStyle w:val="Heading2"/>
+      </w:pPr>
+      <w:r>
+        <w:t>Redis is not connected</w:t>
+      </w:r>
+    </w:p>
+    <w:p>
+      <w:r>
+        <w:t>Redis must be active for the live alerts and summary updates to work properly.</w:t>
+      </w:r>
+    </w:p>
+    <w:p/>
+    <w:p>
+      <w:pPr>
+        <w:pStyle w:val="Heading2"/>
+      </w:pPr>
+      <w:r>
+        <w:t>Data looks outdated</w:t>
+      </w:r>
+    </w:p>
+    <w:p>
+      <w:r>
+        <w:t>Refresh the page or call the /api/refresh endpoint to update the summary and alerts.</w:t>
+      </w:r>
+    </w:p>
+    <w:p/>
+    <w:p>
+      <w:pPr>
+        <w:pStyle w:val="Heading2"/>
+      </w:pPr>
+      <w:r>
+        <w:t>The project shows fallback sample records</w:t>
+      </w:r>
+    </w:p>
+    <w:p>
+      <w:r>
+        <w:t>This usually means the database service is not available. The app was designed to still run in a demonstration mode with placeholder data.</w:t>
+      </w:r>
+    </w:p>
+    <w:p/>
+    <w:p>
+      <w:pPr>
+        <w:pStyle w:val="Heading1"/>
+      </w:pPr>
+      <w:r>
+        <w:t>15. Final Notes for Group Members</w:t>
+      </w:r>
+    </w:p>
+    <w:p>
+      <w:r>
+        <w:t>This project is intentionally kept simple and understandable because it is a student assignment. It is not meant to be a huge industrial project, but it demonstrates the correct use of Python, Flask, MongoDB, and Redis in a real-world smart-city scenario.</w:t>
+      </w:r>
+    </w:p>
+    <w:p/>
+    <w:p>
+      <w:r>
+        <w:t>Every group member should understand the following:</w:t>
+      </w:r>
+    </w:p>
+    <w:p>
+      <w:pPr>
+        <w:pStyle w:val="ListBullet"/>
+      </w:pPr>
+      <w:r>
+        <w:t>why Python and Flask are used</w:t>
+      </w:r>
+    </w:p>
+    <w:p>
+      <w:pPr>
+        <w:pStyle w:val="ListBullet"/>
+      </w:pPr>
+      <w:r>
+        <w:t>why MongoDB is used for permanent data</w:t>
+      </w:r>
+    </w:p>
+    <w:p>
+      <w:pPr>
+        <w:pStyle w:val="ListBullet"/>
+      </w:pPr>
+      <w:r>
+        <w:t>why Redis is used for live data and alerts</w:t>
+      </w:r>
+    </w:p>
+    <w:p>
+      <w:pPr>
+        <w:pStyle w:val="ListBullet"/>
+      </w:pPr>
+      <w:r>
+        <w:t>how the routes work</w:t>
+      </w:r>
+    </w:p>
+    <w:p>
+      <w:pPr>
+        <w:pStyle w:val="ListBullet"/>
+      </w:pPr>
+      <w:r>
+        <w:t>how the dashboard interacts with the backend</w:t>
+      </w:r>
+    </w:p>
+    <w:p>
+      <w:pPr>
+        <w:pStyle w:val="ListBullet"/>
+      </w:pPr>
+      <w:r>
+        <w:t>how the system stores and updates lamp data</w:t>
+      </w:r>
+    </w:p>
+    <w:p>
+      <w:pPr>
+        <w:pStyle w:val="ListBullet"/>
+      </w:pPr>
+      <w:r>
+        <w:t>how to test the system and fix basic issues</w:t>
+      </w:r>
+    </w:p>
+    <w:p/>
+    <w:p>
+      <w:pPr>
+        <w:pStyle w:val="Heading1"/>
+      </w:pPr>
+      <w:r>
+        <w:t>16. Final Summary</w:t>
+      </w:r>
+    </w:p>
+    <w:p>
+      <w:r>
+        <w:t>The Smart Streetlight Management System is a simple but effective solution for monitoring and managing streetlights. It provides a working dashboard, API endpoints, fault tracking, maintenance records, and live data updates. It is suitable for a student assignment because it is realistic, easy to explain, and demonstrates the main design concepts expected in a smart infrastructure system.</w:t>
       </w:r>
     </w:p>
     <w:sectPr>

</xml_diff>